<commit_message>
Add .gitignore and responsiveness to reports page
</commit_message>
<xml_diff>
--- a/debugging-day-4.docx
+++ b/debugging-day-4.docx
@@ -4,6 +4,97 @@
   <w:body>
     <w:p>
       <w:pPr>
+        <w:ind w:left="720" w:hanging="360"/>
+        <w:jc w:val="center"/>
+        <w:rPr>
+          <w:b/>
+          <w:bCs/>
+        </w:rPr>
+      </w:pPr>
+      <w:r>
+        <w:rPr>
+          <w:b/>
+          <w:bCs/>
+        </w:rPr>
+        <w:t>B</w:t>
+      </w:r>
+      <w:r>
+        <w:rPr>
+          <w:b/>
+          <w:bCs/>
+        </w:rPr>
+        <w:t xml:space="preserve">rief written explanation of what </w:t>
+      </w:r>
+      <w:r>
+        <w:rPr>
+          <w:b/>
+          <w:bCs/>
+        </w:rPr>
+        <w:t>I</w:t>
+      </w:r>
+      <w:r>
+        <w:rPr>
+          <w:b/>
+          <w:bCs/>
+        </w:rPr>
+        <w:t xml:space="preserve"> found in </w:t>
+      </w:r>
+      <w:proofErr w:type="spellStart"/>
+      <w:r>
+        <w:rPr>
+          <w:b/>
+          <w:bCs/>
+        </w:rPr>
+        <w:t>DevTools</w:t>
+      </w:r>
+      <w:proofErr w:type="spellEnd"/>
+      <w:r>
+        <w:rPr>
+          <w:b/>
+          <w:bCs/>
+        </w:rPr>
+        <w:t xml:space="preserve"> and what</w:t>
+      </w:r>
+      <w:r>
+        <w:rPr>
+          <w:b/>
+          <w:bCs/>
+        </w:rPr>
+        <w:t xml:space="preserve"> I</w:t>
+      </w:r>
+      <w:r>
+        <w:rPr>
+          <w:b/>
+          <w:bCs/>
+        </w:rPr>
+        <w:t xml:space="preserve"> fixed</w:t>
+      </w:r>
+      <w:r>
+        <w:rPr>
+          <w:b/>
+          <w:bCs/>
+        </w:rPr>
+        <w:t xml:space="preserve"> in </w:t>
+      </w:r>
+      <w:proofErr w:type="spellStart"/>
+      <w:r>
+        <w:rPr>
+          <w:b/>
+          <w:bCs/>
+        </w:rPr>
+        <w:t>parkease</w:t>
+      </w:r>
+      <w:proofErr w:type="spellEnd"/>
+      <w:r>
+        <w:rPr>
+          <w:b/>
+          <w:bCs/>
+        </w:rPr>
+        <w:t xml:space="preserve"> frontend</w:t>
+      </w:r>
+    </w:p>
+    <w:p>
+      <w:pPr>
         <w:pStyle w:val="ListParagraph"/>
         <w:numPr>
           <w:ilvl w:val="0"/>
@@ -24,6 +115,9 @@
     </w:p>
     <w:p>
       <w:r>
+        <w:rPr>
+          <w:noProof/>
+        </w:rPr>
         <w:drawing>
           <wp:inline distT="0" distB="0" distL="0" distR="0" wp14:anchorId="653A6889" wp14:editId="5CE4564C">
             <wp:extent cx="5731510" cy="2853690"/>
@@ -40,7 +134,7 @@
                     <pic:cNvPicPr/>
                   </pic:nvPicPr>
                   <pic:blipFill>
-                    <a:blip r:embed="rId5"/>
+                    <a:blip r:embed="rId7"/>
                     <a:stretch>
                       <a:fillRect/>
                     </a:stretch>
@@ -92,6 +186,9 @@
     </w:p>
     <w:p>
       <w:r>
+        <w:rPr>
+          <w:noProof/>
+        </w:rPr>
         <w:drawing>
           <wp:inline distT="0" distB="0" distL="0" distR="0" wp14:anchorId="4A387732" wp14:editId="2617DF0E">
             <wp:extent cx="5731510" cy="2818130"/>
@@ -108,7 +205,7 @@
                     <pic:cNvPicPr/>
                   </pic:nvPicPr>
                   <pic:blipFill>
-                    <a:blip r:embed="rId6"/>
+                    <a:blip r:embed="rId8"/>
                     <a:stretch>
                       <a:fillRect/>
                     </a:stretch>
@@ -204,7 +301,6 @@
         </w:numPr>
       </w:pPr>
       <w:r>
-        <w:lastRenderedPageBreak/>
         <w:t>Search input not displaying error when no input is submitted but continued to search using null value in signout.html</w:t>
       </w:r>
     </w:p>
@@ -225,6 +321,9 @@
     </w:p>
     <w:p>
       <w:r>
+        <w:rPr>
+          <w:noProof/>
+        </w:rPr>
         <w:drawing>
           <wp:inline distT="0" distB="0" distL="0" distR="0" wp14:anchorId="33E2AD61" wp14:editId="6E7A41E3">
             <wp:extent cx="5731510" cy="2844800"/>
@@ -241,7 +340,7 @@
                     <pic:cNvPicPr/>
                   </pic:nvPicPr>
                   <pic:blipFill>
-                    <a:blip r:embed="rId7"/>
+                    <a:blip r:embed="rId9"/>
                     <a:stretch>
                       <a:fillRect/>
                     </a:stretch>
@@ -290,10 +389,18 @@
     </w:p>
     <w:p>
       <w:r>
-        <w:t xml:space="preserve">Added validation for empty input </w:t>
-      </w:r>
-      <w:r>
-        <w:t xml:space="preserve"> and notifying the user </w:t>
+        <w:t xml:space="preserve">Added validation for empty </w:t>
+      </w:r>
+      <w:proofErr w:type="gramStart"/>
+      <w:r>
+        <w:t xml:space="preserve">input </w:t>
+      </w:r>
+      <w:r>
+        <w:t xml:space="preserve"> and</w:t>
+      </w:r>
+      <w:proofErr w:type="gramEnd"/>
+      <w:r>
+        <w:t xml:space="preserve"> notifying the user </w:t>
       </w:r>
       <w:r>
         <w:t>before searching for the record</w:t>
@@ -303,6 +410,7 @@
     <w:p/>
     <w:p/>
     <w:sectPr>
+      <w:headerReference w:type="default" r:id="rId10"/>
       <w:pgSz w:w="11906" w:h="16838"/>
       <w:pgMar w:top="1440" w:right="1440" w:bottom="1440" w:left="1440" w:header="708" w:footer="708" w:gutter="0"/>
       <w:cols w:space="708"/>
@@ -310,6 +418,78 @@
     </w:sectPr>
   </w:body>
 </w:document>
+</file>
+
+<file path=word/endnotes.xml><?xml version="1.0" encoding="utf-8"?>
+<w:endnotes xmlns:wpc="http://schemas.microsoft.com/office/word/2010/wordprocessingCanvas" xmlns:cx="http://schemas.microsoft.com/office/drawing/2014/chartex" xmlns:cx1="http://schemas.microsoft.com/office/drawing/2015/9/8/chartex" xmlns:cx2="http://schemas.microsoft.com/office/drawing/2015/10/21/chartex" xmlns:cx3="http://schemas.microsoft.com/office/drawing/2016/5/9/chartex" xmlns:cx4="http://schemas.microsoft.com/office/drawing/2016/5/10/chartex" xmlns:cx5="http://schemas.microsoft.com/office/drawing/2016/5/11/chartex" xmlns:cx6="http://schemas.microsoft.com/office/drawing/2016/5/12/chartex" xmlns:cx7="http://schemas.microsoft.com/office/drawing/2016/5/13/chartex" xmlns:cx8="http://schemas.microsoft.com/office/drawing/2016/5/14/chartex" xmlns:mc="http://schemas.openxmlformats.org/markup-compatibility/2006" xmlns:aink="http://schemas.microsoft.com/office/drawing/2016/ink" xmlns:am3d="http://schemas.microsoft.com/office/drawing/2017/model3d" xmlns:o="urn:schemas-microsoft-com:office:office" xmlns:oel="http://schemas.microsoft.com/office/2019/extlst" xmlns:r="http://schemas.openxmlformats.org/officeDocument/2006/relationships" xmlns:m="http://schemas.openxmlformats.org/officeDocument/2006/math" xmlns:v="urn:schemas-microsoft-com:vml" xmlns:wp14="http://schemas.microsoft.com/office/word/2010/wordprocessingDrawing" xmlns:wp="http://schemas.openxmlformats.org/drawingml/2006/wordprocessingDrawing" xmlns:w10="urn:schemas-microsoft-com:office:word" xmlns:w="http://schemas.openxmlformats.org/wordprocessingml/2006/main" xmlns:w14="http://schemas.microsoft.com/office/word/2010/wordml" xmlns:w15="http://schemas.microsoft.com/office/word/2012/wordml" xmlns:w16cex="http://schemas.microsoft.com/office/word/2018/wordml/cex" xmlns:w16cid="http://schemas.microsoft.com/office/word/2016/wordml/cid" xmlns:w16="http://schemas.microsoft.com/office/word/2018/wordml" xmlns:w16du="http://schemas.microsoft.com/office/word/2023/wordml/word16du" xmlns:w16sdtdh="http://schemas.microsoft.com/office/word/2020/wordml/sdtdatahash" xmlns:w16sdtfl="http://schemas.microsoft.com/office/word/2024/wordml/sdtformatlock" xmlns:w16se="http://schemas.microsoft.com/office/word/2015/wordml/symex" xmlns:wpg="http://schemas.microsoft.com/office/word/2010/wordprocessingGroup" xmlns:wpi="http://schemas.microsoft.com/office/word/2010/wordprocessingInk" xmlns:wne="http://schemas.microsoft.com/office/word/2006/wordml" xmlns:wps="http://schemas.microsoft.com/office/word/2010/wordprocessingShape" mc:Ignorable="w14 w15 w16se w16cid w16 w16cex w16sdtdh w16sdtfl w16du wp14">
+  <w:endnote w:type="separator" w:id="-1">
+    <w:p>
+      <w:pPr>
+        <w:spacing w:after="0" w:line="240" w:lineRule="auto"/>
+      </w:pPr>
+      <w:r>
+        <w:separator/>
+      </w:r>
+    </w:p>
+  </w:endnote>
+  <w:endnote w:type="continuationSeparator" w:id="0">
+    <w:p>
+      <w:pPr>
+        <w:spacing w:after="0" w:line="240" w:lineRule="auto"/>
+      </w:pPr>
+      <w:r>
+        <w:continuationSeparator/>
+      </w:r>
+    </w:p>
+  </w:endnote>
+</w:endnotes>
+</file>
+
+<file path=word/footnotes.xml><?xml version="1.0" encoding="utf-8"?>
+<w:footnotes xmlns:wpc="http://schemas.microsoft.com/office/word/2010/wordprocessingCanvas" xmlns:cx="http://schemas.microsoft.com/office/drawing/2014/chartex" xmlns:cx1="http://schemas.microsoft.com/office/drawing/2015/9/8/chartex" xmlns:cx2="http://schemas.microsoft.com/office/drawing/2015/10/21/chartex" xmlns:cx3="http://schemas.microsoft.com/office/drawing/2016/5/9/chartex" xmlns:cx4="http://schemas.microsoft.com/office/drawing/2016/5/10/chartex" xmlns:cx5="http://schemas.microsoft.com/office/drawing/2016/5/11/chartex" xmlns:cx6="http://schemas.microsoft.com/office/drawing/2016/5/12/chartex" xmlns:cx7="http://schemas.microsoft.com/office/drawing/2016/5/13/chartex" xmlns:cx8="http://schemas.microsoft.com/office/drawing/2016/5/14/chartex" xmlns:mc="http://schemas.openxmlformats.org/markup-compatibility/2006" xmlns:aink="http://schemas.microsoft.com/office/drawing/2016/ink" xmlns:am3d="http://schemas.microsoft.com/office/drawing/2017/model3d" xmlns:o="urn:schemas-microsoft-com:office:office" xmlns:oel="http://schemas.microsoft.com/office/2019/extlst" xmlns:r="http://schemas.openxmlformats.org/officeDocument/2006/relationships" xmlns:m="http://schemas.openxmlformats.org/officeDocument/2006/math" xmlns:v="urn:schemas-microsoft-com:vml" xmlns:wp14="http://schemas.microsoft.com/office/word/2010/wordprocessingDrawing" xmlns:wp="http://schemas.openxmlformats.org/drawingml/2006/wordprocessingDrawing" xmlns:w10="urn:schemas-microsoft-com:office:word" xmlns:w="http://schemas.openxmlformats.org/wordprocessingml/2006/main" xmlns:w14="http://schemas.microsoft.com/office/word/2010/wordml" xmlns:w15="http://schemas.microsoft.com/office/word/2012/wordml" xmlns:w16cex="http://schemas.microsoft.com/office/word/2018/wordml/cex" xmlns:w16cid="http://schemas.microsoft.com/office/word/2016/wordml/cid" xmlns:w16="http://schemas.microsoft.com/office/word/2018/wordml" xmlns:w16du="http://schemas.microsoft.com/office/word/2023/wordml/word16du" xmlns:w16sdtdh="http://schemas.microsoft.com/office/word/2020/wordml/sdtdatahash" xmlns:w16sdtfl="http://schemas.microsoft.com/office/word/2024/wordml/sdtformatlock" xmlns:w16se="http://schemas.microsoft.com/office/word/2015/wordml/symex" xmlns:wpg="http://schemas.microsoft.com/office/word/2010/wordprocessingGroup" xmlns:wpi="http://schemas.microsoft.com/office/word/2010/wordprocessingInk" xmlns:wne="http://schemas.microsoft.com/office/word/2006/wordml" xmlns:wps="http://schemas.microsoft.com/office/word/2010/wordprocessingShape" mc:Ignorable="w14 w15 w16se w16cid w16 w16cex w16sdtdh w16sdtfl w16du wp14">
+  <w:footnote w:type="separator" w:id="-1">
+    <w:p>
+      <w:pPr>
+        <w:spacing w:after="0" w:line="240" w:lineRule="auto"/>
+      </w:pPr>
+      <w:r>
+        <w:separator/>
+      </w:r>
+    </w:p>
+  </w:footnote>
+  <w:footnote w:type="continuationSeparator" w:id="0">
+    <w:p>
+      <w:pPr>
+        <w:spacing w:after="0" w:line="240" w:lineRule="auto"/>
+      </w:pPr>
+      <w:r>
+        <w:continuationSeparator/>
+      </w:r>
+    </w:p>
+  </w:footnote>
+</w:footnotes>
+</file>
+
+<file path=word/header1.xml><?xml version="1.0" encoding="utf-8"?>
+<w:hdr xmlns:wpc="http://schemas.microsoft.com/office/word/2010/wordprocessingCanvas" xmlns:cx="http://schemas.microsoft.com/office/drawing/2014/chartex" xmlns:cx1="http://schemas.microsoft.com/office/drawing/2015/9/8/chartex" xmlns:cx2="http://schemas.microsoft.com/office/drawing/2015/10/21/chartex" xmlns:cx3="http://schemas.microsoft.com/office/drawing/2016/5/9/chartex" xmlns:cx4="http://schemas.microsoft.com/office/drawing/2016/5/10/chartex" xmlns:cx5="http://schemas.microsoft.com/office/drawing/2016/5/11/chartex" xmlns:cx6="http://schemas.microsoft.com/office/drawing/2016/5/12/chartex" xmlns:cx7="http://schemas.microsoft.com/office/drawing/2016/5/13/chartex" xmlns:cx8="http://schemas.microsoft.com/office/drawing/2016/5/14/chartex" xmlns:mc="http://schemas.openxmlformats.org/markup-compatibility/2006" xmlns:aink="http://schemas.microsoft.com/office/drawing/2016/ink" xmlns:am3d="http://schemas.microsoft.com/office/drawing/2017/model3d" xmlns:o="urn:schemas-microsoft-com:office:office" xmlns:oel="http://schemas.microsoft.com/office/2019/extlst" xmlns:r="http://schemas.openxmlformats.org/officeDocument/2006/relationships" xmlns:m="http://schemas.openxmlformats.org/officeDocument/2006/math" xmlns:v="urn:schemas-microsoft-com:vml" xmlns:wp14="http://schemas.microsoft.com/office/word/2010/wordprocessingDrawing" xmlns:wp="http://schemas.openxmlformats.org/drawingml/2006/wordprocessingDrawing" xmlns:w10="urn:schemas-microsoft-com:office:word" xmlns:w="http://schemas.openxmlformats.org/wordprocessingml/2006/main" xmlns:w14="http://schemas.microsoft.com/office/word/2010/wordml" xmlns:w15="http://schemas.microsoft.com/office/word/2012/wordml" xmlns:w16cex="http://schemas.microsoft.com/office/word/2018/wordml/cex" xmlns:w16cid="http://schemas.microsoft.com/office/word/2016/wordml/cid" xmlns:w16="http://schemas.microsoft.com/office/word/2018/wordml" xmlns:w16du="http://schemas.microsoft.com/office/word/2023/wordml/word16du" xmlns:w16sdtdh="http://schemas.microsoft.com/office/word/2020/wordml/sdtdatahash" xmlns:w16sdtfl="http://schemas.microsoft.com/office/word/2024/wordml/sdtformatlock" xmlns:w16se="http://schemas.microsoft.com/office/word/2015/wordml/symex" xmlns:wpg="http://schemas.microsoft.com/office/word/2010/wordprocessingGroup" xmlns:wpi="http://schemas.microsoft.com/office/word/2010/wordprocessingInk" xmlns:wne="http://schemas.microsoft.com/office/word/2006/wordml" xmlns:wps="http://schemas.microsoft.com/office/word/2010/wordprocessingShape" mc:Ignorable="w14 w15 w16se w16cid w16 w16cex w16sdtdh w16sdtfl w16du wp14">
+  <w:p>
+    <w:pPr>
+      <w:pStyle w:val="Header"/>
+      <w:jc w:val="right"/>
+      <w:rPr>
+        <w:sz w:val="18"/>
+        <w:szCs w:val="18"/>
+      </w:rPr>
+    </w:pPr>
+    <w:r>
+      <w:rPr>
+        <w:sz w:val="18"/>
+        <w:szCs w:val="18"/>
+      </w:rPr>
+      <w:t>Namukasa Proscovia</w:t>
+    </w:r>
+  </w:p>
+</w:hdr>
 </file>
 
 <file path=word/numbering.xml><?xml version="1.0" encoding="utf-8"?>
@@ -1012,7 +1192,6 @@
   <w:style w:type="character" w:default="1" w:styleId="DefaultParagraphFont">
     <w:name w:val="Default Paragraph Font"/>
     <w:uiPriority w:val="1"/>
-    <w:semiHidden/>
     <w:unhideWhenUsed/>
   </w:style>
   <w:style w:type="table" w:default="1" w:styleId="TableNormal">
@@ -1325,6 +1504,50 @@
       <w:color w:val="2F5496" w:themeColor="accent1" w:themeShade="BF"/>
       <w:spacing w:val="5"/>
     </w:rPr>
+  </w:style>
+  <w:style w:type="paragraph" w:styleId="Header">
+    <w:name w:val="header"/>
+    <w:basedOn w:val="Normal"/>
+    <w:link w:val="HeaderChar"/>
+    <w:uiPriority w:val="99"/>
+    <w:unhideWhenUsed/>
+    <w:rsid w:val="008C2DCF"/>
+    <w:pPr>
+      <w:tabs>
+        <w:tab w:val="center" w:pos="4513"/>
+        <w:tab w:val="right" w:pos="9026"/>
+      </w:tabs>
+      <w:spacing w:after="0" w:line="240" w:lineRule="auto"/>
+    </w:pPr>
+  </w:style>
+  <w:style w:type="character" w:customStyle="1" w:styleId="HeaderChar">
+    <w:name w:val="Header Char"/>
+    <w:basedOn w:val="DefaultParagraphFont"/>
+    <w:link w:val="Header"/>
+    <w:uiPriority w:val="99"/>
+    <w:rsid w:val="008C2DCF"/>
+  </w:style>
+  <w:style w:type="paragraph" w:styleId="Footer">
+    <w:name w:val="footer"/>
+    <w:basedOn w:val="Normal"/>
+    <w:link w:val="FooterChar"/>
+    <w:uiPriority w:val="99"/>
+    <w:unhideWhenUsed/>
+    <w:rsid w:val="008C2DCF"/>
+    <w:pPr>
+      <w:tabs>
+        <w:tab w:val="center" w:pos="4513"/>
+        <w:tab w:val="right" w:pos="9026"/>
+      </w:tabs>
+      <w:spacing w:after="0" w:line="240" w:lineRule="auto"/>
+    </w:pPr>
+  </w:style>
+  <w:style w:type="character" w:customStyle="1" w:styleId="FooterChar">
+    <w:name w:val="Footer Char"/>
+    <w:basedOn w:val="DefaultParagraphFont"/>
+    <w:link w:val="Footer"/>
+    <w:uiPriority w:val="99"/>
+    <w:rsid w:val="008C2DCF"/>
   </w:style>
 </w:styles>
 </file>

</xml_diff>